<commit_message>
docs(AASPCNJ01): QA = Caroline Sousa / GQA = Jonathan Barbosa (corrige notas antigas)
Alinha 00_INDICE e CAP ao que ja constava no TAP-AASPCNJ01-001 e GQA-AASPCNJ01-001:
- 00_INDICE: "Analista de Testes (QA) -> Jonatan" -> Caroline Sousa;
  "Auditor de GQA (independente) -> Wilson Yamada" -> Jonathan Barbosa.
- CAP: "Jonatan - Analista de Testes" -> Caroline Sousa.
Carol (Caroline Sousa) passa a ser a unica QA do projeto; Jonathan Barbosa
e o auditor de GQA independente. Confirmado com o responsavel.

Co-Authored-By: Claude Opus 4.8 (1M context) <noreply@anthropic.com>
</commit_message>
<xml_diff>
--- a/mps-nivel-c/oficial/04_registros/AASP_CNJ/00_INDICE-AASPCNJ01_Mapa-de-Registros.docx
+++ b/mps-nivel-c/oficial/04_registros/AASP_CNJ/00_INDICE-AASPCNJ01_Mapa-de-Registros.docx
@@ -5480,7 +5480,7 @@
           <w:i w:val="0"/>
           <w:sz w:val="22"/>
         </w:rPr>
-        <w:t xml:space="preserve">Analista de Testes (QA) → </w:t>
+        <w:t>Analista de Testes (QA) → Caroline Sousa</w:t>
       </w:r>
       <w:r>
         <w:rPr>
@@ -5489,7 +5489,6 @@
           <w:i w:val="0"/>
           <w:sz w:val="22"/>
         </w:rPr>
-        <w:t>Jonatan</w:t>
       </w:r>
     </w:p>
     <w:p>
@@ -5552,7 +5551,7 @@
           <w:i w:val="0"/>
           <w:sz w:val="22"/>
         </w:rPr>
-        <w:t xml:space="preserve">Auditor de GQA (independente) → </w:t>
+        <w:t>Auditor de GQA (independente) → Jonathan Barbosa</w:t>
       </w:r>
       <w:r>
         <w:rPr>
@@ -5561,7 +5560,6 @@
           <w:i w:val="0"/>
           <w:sz w:val="22"/>
         </w:rPr>
-        <w:t>Wilson Yamada</w:t>
       </w:r>
     </w:p>
     <w:p>

</xml_diff>

<commit_message>
docs(AASPCNJ01): 00_INDICE — alinha nomes no historico (GQA Wilson Yamada->Jonathan Barbosa; Cezar Hiraki->Cezar Hiraki Velazquez)
Achado da auditoria CNJ (NC-PAP-01/02, NC-CON-01): o historico do indice citava
o GQA como Wilson Yamada (COO) e o Arquiteto como 'Cezar Hiraki' (sem sobrenome),
contradizendo a correcao QA/GQA aprovada e o corpo dos docs. Alinhado.

Co-Authored-By: Claude Opus 4.8 (1M context) <noreply@anthropic.com>
</commit_message>
<xml_diff>
--- a/mps-nivel-c/oficial/04_registros/AASP_CNJ/00_INDICE-AASPCNJ01_Mapa-de-Registros.docx
+++ b/mps-nivel-c/oficial/04_registros/AASP_CNJ/00_INDICE-AASPCNJ01_Mapa-de-Registros.docx
@@ -5469,7 +5469,7 @@
           <w:i w:val="0"/>
           <w:sz w:val="22"/>
         </w:rPr>
-        <w:t xml:space="preserve">Arquiteto de Software → </w:t>
+        <w:t>Arquiteto de Software → Cézar Hiraki Velázquez</w:t>
       </w:r>
       <w:r>
         <w:rPr>
@@ -5478,7 +5478,6 @@
           <w:i w:val="0"/>
           <w:sz w:val="22"/>
         </w:rPr>
-        <w:t>Cézar Hiraki</w:t>
       </w:r>
     </w:p>
     <w:p>
@@ -5639,7 +5638,7 @@
           <w:color w:val="1A5276"/>
           <w:sz w:val="22"/>
         </w:rPr>
-        <w:t>Equipe confirmada com sobrenomes. Cézar Hiraki é o mesmo Arquiteto do projeto FTGASMIG. "Time de Desenvolvimento" = Raony Chagas + Levi Santos.</w:t>
+        <w:t>Equipe confirmada com sobrenomes. Cézar Hiraki Velázquez é o mesmo Arquiteto do projeto FTGASMIG. "Time de Desenvolvimento" = Raony Chagas + Levi Santos.</w:t>
       </w:r>
     </w:p>
     <w:p>
@@ -6355,7 +6354,7 @@
                 <w:i w:val="0"/>
                 <w:sz w:val="20"/>
               </w:rPr>
-              <w:t>Nomes reais aplicados aos 18 registros (Abraão Oliveira, Cézar Hiraki, Raony Chagas, Levi Santos, Jonatan, David, Carlos Alves; auditor GQA Wilson Yamada) — 71 substituições nos campos de identificação/responsável. Pendentes: planilha de gestão (GEST) e Onda 3 (encerramento).</w:t>
+              <w:t>Nomes reais aplicados aos 18 registros (Abraão Oliveira, Cézar Hiraki Velázquez, Raony Chagas, Levi Santos, Jonatan, David, Carlos Alves; auditor de GQA Jonathan Barbosa) — 71 substituições nos campos de identificação/responsável. Pendentes: planilha de gestão (GEST) e Onda 3 (encerramento).</w:t>
             </w:r>
           </w:p>
         </w:tc>
@@ -6673,7 +6672,7 @@
                 <w:i w:val="0"/>
                 <w:sz w:val="20"/>
               </w:rPr>
-              <w:t>Sobrenome do Arquiteto confirmado: Cézar Hiraki — aplicado nos 18 registros e na planilha; .docx regenerados. Equipe completa.</w:t>
+              <w:t>Sobrenome do Arquiteto confirmado: Cézar Hiraki Velázquez — aplicado nos 18 registros e na planilha; .docx regenerados. Equipe completa.</w:t>
             </w:r>
           </w:p>
         </w:tc>

</xml_diff>

<commit_message>
auditoria geral (CNJ): harmoniza equipe/cliente/tags ao GitLab (diagnóstico MPS-SW)
- Equipe (índice + CAP) alinhada aos nomes da evidência/GitLab:
  Levi Santos->Mateus Veloso; Jonatan->Caroline Sousa; David->Lucas Batista;
  Wilson Yamada (auditor GQA)->Jonathan Barbosa
- Representante do cliente: Carlos Alves -> Marcos Turnes
- Tags GMUD -> nomenclatura semântica: v230->v1.0.0 (BL-EPROC), v240->v2.0.0 (BL-CNJ), v241->v2.0.2 (BL-HOTFIX)

Co-Authored-By: Claude Opus 4.8 <noreply@anthropic.com>
</commit_message>
<xml_diff>
--- a/mps-nivel-c/oficial/04_registros/AASP_CNJ/00_INDICE-AASPCNJ01_Mapa-de-Registros.docx
+++ b/mps-nivel-c/oficial/04_registros/AASP_CNJ/00_INDICE-AASPCNJ01_Mapa-de-Registros.docx
@@ -5465,7 +5465,7 @@
           <w:i w:val="0"/>
           <w:sz w:val="22"/>
         </w:rPr>
-        <w:t>Levi Santos</w:t>
+        <w:t>Mateus Veloso</w:t>
       </w:r>
     </w:p>
     <w:p>
@@ -5489,7 +5489,7 @@
           <w:i w:val="0"/>
           <w:sz w:val="22"/>
         </w:rPr>
-        <w:t>Jonatan</w:t>
+        <w:t>Caroline Sousa</w:t>
       </w:r>
     </w:p>
     <w:p>
@@ -5513,7 +5513,7 @@
           <w:i w:val="0"/>
           <w:sz w:val="22"/>
         </w:rPr>
-        <w:t>David</w:t>
+        <w:t>Lucas Batista</w:t>
       </w:r>
     </w:p>
     <w:p>
@@ -5537,7 +5537,7 @@
           <w:i w:val="0"/>
           <w:sz w:val="22"/>
         </w:rPr>
-        <w:t>Carlos Alves</w:t>
+        <w:t>Marcos Turnes</w:t>
       </w:r>
     </w:p>
     <w:p>
@@ -5561,7 +5561,7 @@
           <w:i w:val="0"/>
           <w:sz w:val="22"/>
         </w:rPr>
-        <w:t>Wilson Yamada</w:t>
+        <w:t>Jonathan Barbosa</w:t>
       </w:r>
     </w:p>
     <w:p>
@@ -5580,7 +5580,7 @@
           <w:color w:val="1A5276"/>
           <w:sz w:val="22"/>
         </w:rPr>
-        <w:t>Equipe confirmada com sobrenomes. Cézar Hiraki é o mesmo Arquiteto do projeto FTGASMIG. "Time de Desenvolvimento" = Raony Chagas + Levi Santos.</w:t>
+        <w:t>Equipe confirmada com sobrenomes. Cézar Hiraki é o mesmo Arquiteto do projeto FTGASMIG. "Time de Desenvolvimento" = Raony Chagas + Mateus Veloso.</w:t>
       </w:r>
     </w:p>
     <w:p>
@@ -5639,7 +5639,7 @@
           <w:i w:val="0"/>
           <w:sz w:val="22"/>
         </w:rPr>
-        <w:t>Baseline de configuração entregue (GCO) — confirmar a tag de versão (o doc cita "v240").</w:t>
+        <w:t>Baseline de configuração entregue (GCO) — confirmar a tag de versão (o doc cita "v2.0.0").</w:t>
       </w:r>
     </w:p>
     <w:p>
@@ -6296,7 +6296,7 @@
                 <w:i w:val="0"/>
                 <w:sz w:val="20"/>
               </w:rPr>
-              <w:t>Nomes reais aplicados aos 18 registros (Abraão Oliveira, Cézar Hiraki, Raony Chagas, Levi Santos, Jonatan, David, Carlos Alves; auditor GQA Wilson Yamada) — 71 substituições nos campos de identificação/responsável. Pendentes: planilha de gestão (GEST) e Onda 3 (encerramento).</w:t>
+              <w:t>Nomes reais aplicados aos 18 registros (Abraão Oliveira, Cézar Hiraki, Raony Chagas, Mateus Veloso, Caroline Sousa, Lucas Batista, Marcos Turnes; auditor GQA Jonathan Barbosa) — 71 substituições nos campos de identificação/responsável. Pendentes: planilha de gestão (GEST) e Onda 3 (encerramento).</w:t>
             </w:r>
           </w:p>
         </w:tc>
@@ -6508,7 +6508,7 @@
                 <w:i w:val="0"/>
                 <w:sz w:val="20"/>
               </w:rPr>
-              <w:t>Sobrenomes aplicados (Raony Chagas, Levi Santos) nos .md e na planilha; .docx regenerados. Criado COLETA-EVIDENCIAS_AASPCNJ (interno) para levantamento de evidências técnicas com o Tech Lead/Dev.</w:t>
+              <w:t>Sobrenomes aplicados (Raony Chagas, Mateus Veloso) nos .md e na planilha; .docx regenerados. Criado COLETA-EVIDENCIAS_AASPCNJ (interno) para levantamento de evidências técnicas com o Tech Lead/Dev.</w:t>
             </w:r>
           </w:p>
         </w:tc>

</xml_diff>

<commit_message>
auditoria geral (CNJ): encerramento previsto -> 31/08/2026 + registro da GMUD no RAC
- data de encerramento 30/06 -> 31/08/2026 (deploy GMUD em agosto)
- RAC: registrado o trabalho GMUD (reenfileiramento/erros CNJ), MR !22 e deploy de agosto

Co-Authored-By: Claude Opus 4.8 <noreply@anthropic.com>
</commit_message>
<xml_diff>
--- a/mps-nivel-c/oficial/04_registros/AASP_CNJ/00_INDICE-AASPCNJ01_Mapa-de-Registros.docx
+++ b/mps-nivel-c/oficial/04_registros/AASP_CNJ/00_INDICE-AASPCNJ01_Mapa-de-Registros.docx
@@ -758,7 +758,7 @@
           <w:i w:val="0"/>
           <w:sz w:val="22"/>
         </w:rPr>
-        <w:t xml:space="preserve"> 30/06/2026.</w:t>
+        <w:t xml:space="preserve"> 31/08/2026.</w:t>
       </w:r>
     </w:p>
     <w:p>
@@ -884,7 +884,7 @@
           <w:i w:val="0"/>
           <w:sz w:val="22"/>
         </w:rPr>
-        <w:t xml:space="preserve"> (TAE, Lições Aprendidas, Ata de Aceite Final) aguardam o aceite formal (~30/06/2026).</w:t>
+        <w:t xml:space="preserve"> (TAE, Lições Aprendidas, Ata de Aceite Final) aguardam o aceite formal (~31/08/2026).</w:t>
       </w:r>
     </w:p>
     <w:p>
@@ -4446,7 +4446,7 @@
         <w:keepLines/>
       </w:pPr>
       <w:r>
-        <w:t>Onda 3 — Encerramento (aguardar aceite formal ~30/06/2026)</w:t>
+        <w:t>Onda 3 — Encerramento (aguardar aceite formal ~31/08/2026)</w:t>
       </w:r>
     </w:p>
     <w:tbl>

</xml_diff>